<commit_message>
feat(contact): embed OSINT CTF secret flag in contact section and optimize UI components
</commit_message>
<xml_diff>
--- a/public/CV_Ahmad_Rafi_Sutanto.docx
+++ b/public/CV_Ahmad_Rafi_Sutanto.docx
@@ -32,7 +32,7 @@
           <w:sz w:val="20"/>
           <w:szCs w:val="20"/>
         </w:rPr>
-        <w:t xml:space="preserve">Blue Team &amp; Digital Forensics - Cyber Security Student</w:t>
+        <w:t xml:space="preserve">Digital Forensics &amp; Incident Response (DFIR) | Threat Analysis</w:t>
       </w:r>
     </w:p>
     <w:p>
@@ -132,7 +132,7 @@
           <w:sz w:val="19"/>
           <w:szCs w:val="19"/>
         </w:rPr>
-        <w:t xml:space="preserve">Undergraduate Cyber Security student at BINUS University specializing in Blue Team Operations, Digital Forensics &amp; Incident Response (DFIR), and Threat Hunting. Proven track record designing 30+ national-level CTF challenges and leading 20+ challenge authors within the BINUS Cyber Security Community. Hands-on experience in volatile memory analysis, Windows/Linux artifact forensics, packet inspection, and CI/CD security automation.</w:t>
+        <w:t xml:space="preserve">Undergraduate Cyber Security student at BINUS University specializing in Blue Team Operations, Digital Forensics &amp; Incident Response (DFIR), and Threat Detection. Experienced in engineering 30+ national-level CTF challenges and leading 20+ technical authors across university security initiatives. Demonstrates hands-on capability in volatile memory triage, Windows/Linux artifact analysis, SIEM telemetry correlation, and CI/CD security automation. Seeking to contribute analytical problem-solving and cyber defense skills to KPMG Advisory (Internship / Co-op).</w:t>
       </w:r>
     </w:p>
     <w:p>
@@ -243,6 +243,34 @@
           <w:sz w:val="19"/>
           <w:szCs w:val="19"/>
         </w:rPr>
+        <w:t xml:space="preserve">Security Frameworks &amp; Standards: </w:t>
+      </w:r>
+      <w:r>
+        <w:rPr>
+          <w:color w:val="000000"/>
+          <w:sz w:val="19"/>
+          <w:szCs w:val="19"/>
+        </w:rPr>
+        <w:t xml:space="preserve">MITRE ATT&amp;CK, NIST SP 800-61 (Incident Handling), ISO/IEC 27001 (Foundational), OWASP Top 10</w:t>
+      </w:r>
+    </w:p>
+    <w:p>
+      <w:pPr>
+        <w:pStyle w:val="ListParagraph"/>
+        <w:numPr>
+          <w:ilvl w:val="0"/>
+          <w:numId w:val="2"/>
+        </w:numPr>
+        <w:spacing w:after="40"/>
+      </w:pPr>
+      <w:r>
+        <w:rPr>
+          <w:b/>
+          <w:bCs/>
+          <w:color w:val="000000"/>
+          <w:sz w:val="19"/>
+          <w:szCs w:val="19"/>
+        </w:rPr>
         <w:t xml:space="preserve">Digital Forensics &amp; Reverse Engineering: </w:t>
       </w:r>
       <w:r>
@@ -341,7 +369,7 @@
           <w:sz w:val="20"/>
           <w:szCs w:val="20"/>
         </w:rPr>
-        <w:t xml:space="preserve">Challenge Author, Digital Forensics</w:t>
+        <w:t xml:space="preserve">Digital Forensics Apprentice &amp; Challenge Author</w:t>
       </w:r>
     </w:p>
     <w:p>
@@ -359,7 +387,7 @@
           <w:sz w:val="18"/>
           <w:szCs w:val="18"/>
         </w:rPr>
-        <w:t xml:space="preserve">PETIR Cyber Security - IFEST 2026 (HIMATIF UNPAD)</w:t>
+        <w:t xml:space="preserve">PETIR Cyber Security</w:t>
       </w:r>
       <w:r>
         <w:rPr>
@@ -369,43 +397,61 @@
           <w:sz w:val="18"/>
           <w:szCs w:val="18"/>
         </w:rPr>
-        <w:t xml:space="preserve">	Aug 2026</w:t>
-      </w:r>
-    </w:p>
-    <w:p>
-      <w:pPr>
-        <w:pStyle w:val="ListParagraph"/>
-        <w:numPr>
-          <w:ilvl w:val="0"/>
-          <w:numId w:val="2"/>
-        </w:numPr>
-        <w:spacing w:after="40"/>
-      </w:pPr>
-      <w:r>
-        <w:rPr>
-          <w:color w:val="000000"/>
-          <w:sz w:val="19"/>
-          <w:szCs w:val="19"/>
-        </w:rPr>
-        <w:t xml:space="preserve">Designed a "Dead Box" forensics challenge simulating an encrypted LUKS partition, ext4 unallocated-block data carving, and hidden keyfile extraction.</w:t>
-      </w:r>
-    </w:p>
-    <w:p>
-      <w:pPr>
-        <w:pStyle w:val="ListParagraph"/>
-        <w:numPr>
-          <w:ilvl w:val="0"/>
-          <w:numId w:val="2"/>
-        </w:numPr>
-        <w:spacing w:after="40"/>
-      </w:pPr>
-      <w:r>
-        <w:rPr>
-          <w:color w:val="000000"/>
-          <w:sz w:val="19"/>
-          <w:szCs w:val="19"/>
-        </w:rPr>
-        <w:t xml:space="preserve">Built a multi-stage attack scenario spanning Linux PAM log exploitation, Git object (zlib) extraction, and ELF binary analysis; delivered the official writeup and an automated solver/validation harness.</w:t>
+        <w:t xml:space="preserve">	Mar 2026 - Present</w:t>
+      </w:r>
+    </w:p>
+    <w:p>
+      <w:pPr>
+        <w:pStyle w:val="ListParagraph"/>
+        <w:numPr>
+          <w:ilvl w:val="0"/>
+          <w:numId w:val="2"/>
+        </w:numPr>
+        <w:spacing w:after="40"/>
+      </w:pPr>
+      <w:r>
+        <w:rPr>
+          <w:color w:val="000000"/>
+          <w:sz w:val="19"/>
+          <w:szCs w:val="19"/>
+        </w:rPr>
+        <w:t xml:space="preserve">Conduct advanced threat detection, network threat hunting, and data-exfiltration triage alongside senior security researchers.</w:t>
+      </w:r>
+    </w:p>
+    <w:p>
+      <w:pPr>
+        <w:pStyle w:val="ListParagraph"/>
+        <w:numPr>
+          <w:ilvl w:val="0"/>
+          <w:numId w:val="2"/>
+        </w:numPr>
+        <w:spacing w:after="40"/>
+      </w:pPr>
+      <w:r>
+        <w:rPr>
+          <w:color w:val="000000"/>
+          <w:sz w:val="19"/>
+          <w:szCs w:val="19"/>
+        </w:rPr>
+        <w:t xml:space="preserve">Designed and validated multi-stage forensic challenges for national competitions (IFEST 2026 UNPAD &amp; BeeCTF 2026), simulating encrypted LUKS partitions, ext4 unallocated-block data carving, Linux PAM exploitation, and Arch Linux AUR supply-chain compromises.</w:t>
+      </w:r>
+    </w:p>
+    <w:p>
+      <w:pPr>
+        <w:pStyle w:val="ListParagraph"/>
+        <w:numPr>
+          <w:ilvl w:val="0"/>
+          <w:numId w:val="2"/>
+        </w:numPr>
+        <w:spacing w:after="40"/>
+      </w:pPr>
+      <w:r>
+        <w:rPr>
+          <w:color w:val="000000"/>
+          <w:sz w:val="19"/>
+          <w:szCs w:val="19"/>
+        </w:rPr>
+        <w:t xml:space="preserve">Authored comprehensive investigation writeups and automated solver/validation harnesses detailing dual-path analysis via CLI (Linux/WSL) and GUI forensics tools (FTK Imager).</w:t>
       </w:r>
     </w:p>
     <w:p>
@@ -420,7 +466,7 @@
           <w:sz w:val="20"/>
           <w:szCs w:val="20"/>
         </w:rPr>
-        <w:t xml:space="preserve">Challenge Author, Digital Forensics</w:t>
+        <w:t xml:space="preserve">Deputy Coordinator, Research &amp; Development</w:t>
       </w:r>
     </w:p>
     <w:p>
@@ -438,7 +484,7 @@
           <w:sz w:val="18"/>
           <w:szCs w:val="18"/>
         </w:rPr>
-        <w:t xml:space="preserve">PETIR Cyber Security - BeeCTF 2026 (Beefest, BINUS)</w:t>
+        <w:t xml:space="preserve">Cyber Security Community (CSC), BINUS University</w:t>
       </w:r>
       <w:r>
         <w:rPr>
@@ -448,43 +494,79 @@
           <w:sz w:val="18"/>
           <w:szCs w:val="18"/>
         </w:rPr>
-        <w:t xml:space="preserve">	Aug 2026</w:t>
-      </w:r>
-    </w:p>
-    <w:p>
-      <w:pPr>
-        <w:pStyle w:val="ListParagraph"/>
-        <w:numPr>
-          <w:ilvl w:val="0"/>
-          <w:numId w:val="2"/>
-        </w:numPr>
-        <w:spacing w:after="40"/>
-      </w:pPr>
-      <w:r>
-        <w:rPr>
-          <w:color w:val="000000"/>
-          <w:sz w:val="19"/>
-          <w:szCs w:val="19"/>
-        </w:rPr>
-        <w:t xml:space="preserve">Designed "The Poisoned AUR," simulating an Arch Linux supply-chain compromise via a malicious AUR package.</w:t>
-      </w:r>
-    </w:p>
-    <w:p>
-      <w:pPr>
-        <w:pStyle w:val="ListParagraph"/>
-        <w:numPr>
-          <w:ilvl w:val="0"/>
-          <w:numId w:val="2"/>
-        </w:numPr>
-        <w:spacing w:after="40"/>
-      </w:pPr>
-      <w:r>
-        <w:rPr>
-          <w:color w:val="000000"/>
-          <w:sz w:val="19"/>
-          <w:szCs w:val="19"/>
-        </w:rPr>
-        <w:t xml:space="preserve">Constructed layered forensic evidence (ALPM logs, shell history, systemd journal, ELF headers, xattr) and authored a dual-path CLI (WSL2/Linux) and GUI (FTK Imager) investigation writeup.</w:t>
+        <w:t xml:space="preserve">	Oct 2025 - Present</w:t>
+      </w:r>
+    </w:p>
+    <w:p>
+      <w:pPr>
+        <w:pStyle w:val="ListParagraph"/>
+        <w:numPr>
+          <w:ilvl w:val="0"/>
+          <w:numId w:val="2"/>
+        </w:numPr>
+        <w:spacing w:after="40"/>
+      </w:pPr>
+      <w:r>
+        <w:rPr>
+          <w:color w:val="000000"/>
+          <w:sz w:val="19"/>
+          <w:szCs w:val="19"/>
+        </w:rPr>
+        <w:t xml:space="preserve">Lead technical operations for CSC's R&amp;D division and CTF competition infrastructure.</w:t>
+      </w:r>
+    </w:p>
+    <w:p>
+      <w:pPr>
+        <w:pStyle w:val="ListParagraph"/>
+        <w:numPr>
+          <w:ilvl w:val="0"/>
+          <w:numId w:val="2"/>
+        </w:numPr>
+        <w:spacing w:after="40"/>
+      </w:pPr>
+      <w:r>
+        <w:rPr>
+          <w:color w:val="000000"/>
+          <w:sz w:val="19"/>
+          <w:szCs w:val="19"/>
+        </w:rPr>
+        <w:t xml:space="preserve">Architected an automated CI/CD pipeline (GitHub Actions + ctfcli + Docker/VPS) for CSC CTF 2026, eliminating manual deployment on competition day.</w:t>
+      </w:r>
+    </w:p>
+    <w:p>
+      <w:pPr>
+        <w:pStyle w:val="ListParagraph"/>
+        <w:numPr>
+          <w:ilvl w:val="0"/>
+          <w:numId w:val="2"/>
+        </w:numPr>
+        <w:spacing w:after="40"/>
+      </w:pPr>
+      <w:r>
+        <w:rPr>
+          <w:color w:val="000000"/>
+          <w:sz w:val="19"/>
+          <w:szCs w:val="19"/>
+        </w:rPr>
+        <w:t xml:space="preserve">Coordinate 20+ challenge authors across 6 categories; review 79 pull requests, authoring 128 of 285 total commits (45%).</w:t>
+      </w:r>
+    </w:p>
+    <w:p>
+      <w:pPr>
+        <w:pStyle w:val="ListParagraph"/>
+        <w:numPr>
+          <w:ilvl w:val="0"/>
+          <w:numId w:val="2"/>
+        </w:numPr>
+        <w:spacing w:after="40"/>
+      </w:pPr>
+      <w:r>
+        <w:rPr>
+          <w:color w:val="000000"/>
+          <w:sz w:val="19"/>
+          <w:szCs w:val="19"/>
+        </w:rPr>
+        <w:t xml:space="preserve">Deliver hands-on workshops on volatile memory forensics and Windows event log triage.</w:t>
       </w:r>
     </w:p>
     <w:p>
@@ -499,7 +581,7 @@
           <w:sz w:val="20"/>
           <w:szCs w:val="20"/>
         </w:rPr>
-        <w:t xml:space="preserve">Apprentice</w:t>
+        <w:t xml:space="preserve">Project Officer (PIC), National Cyber Week 2025</w:t>
       </w:r>
     </w:p>
     <w:p>
@@ -517,7 +599,7 @@
           <w:sz w:val="18"/>
           <w:szCs w:val="18"/>
         </w:rPr>
-        <w:t xml:space="preserve">PETIR Cyber Security</w:t>
+        <w:t xml:space="preserve">Cyber Security Community (CSC), BINUS University</w:t>
       </w:r>
       <w:r>
         <w:rPr>
@@ -527,200 +609,6 @@
           <w:sz w:val="18"/>
           <w:szCs w:val="18"/>
         </w:rPr>
-        <w:t xml:space="preserve">	Mar 2026 - Present</w:t>
-      </w:r>
-    </w:p>
-    <w:p>
-      <w:pPr>
-        <w:pStyle w:val="ListParagraph"/>
-        <w:numPr>
-          <w:ilvl w:val="0"/>
-          <w:numId w:val="2"/>
-        </w:numPr>
-        <w:spacing w:after="40"/>
-      </w:pPr>
-      <w:r>
-        <w:rPr>
-          <w:color w:val="000000"/>
-          <w:sz w:val="19"/>
-          <w:szCs w:val="19"/>
-        </w:rPr>
-        <w:t xml:space="preserve">Conduct advanced threat detection and forensic problem-set analysis with senior security researchers.</w:t>
-      </w:r>
-    </w:p>
-    <w:p>
-      <w:pPr>
-        <w:pStyle w:val="ListParagraph"/>
-        <w:numPr>
-          <w:ilvl w:val="0"/>
-          <w:numId w:val="2"/>
-        </w:numPr>
-        <w:spacing w:after="40"/>
-      </w:pPr>
-      <w:r>
-        <w:rPr>
-          <w:color w:val="000000"/>
-          <w:sz w:val="19"/>
-          <w:szCs w:val="19"/>
-        </w:rPr>
-        <w:t xml:space="preserve">Execute Blue Team defensive simulations, network threat hunting, and data-exfiltration triage across server environments.</w:t>
-      </w:r>
-    </w:p>
-    <w:p>
-      <w:pPr>
-        <w:spacing w:after="6" w:before="100"/>
-      </w:pPr>
-      <w:r>
-        <w:rPr>
-          <w:b/>
-          <w:bCs/>
-          <w:color w:val="000000"/>
-          <w:sz w:val="20"/>
-          <w:szCs w:val="20"/>
-        </w:rPr>
-        <w:t xml:space="preserve">Deputy Coordinator, Research &amp; Development</w:t>
-      </w:r>
-    </w:p>
-    <w:p>
-      <w:pPr>
-        <w:tabs>
-          <w:tab w:val="right" w:pos="11000"/>
-        </w:tabs>
-        <w:spacing w:after="30"/>
-      </w:pPr>
-      <w:r>
-        <w:rPr>
-          <w:i/>
-          <w:iCs/>
-          <w:color w:val="000000"/>
-          <w:sz w:val="18"/>
-          <w:szCs w:val="18"/>
-        </w:rPr>
-        <w:t xml:space="preserve">Cyber Security Community (CSC), BINUS University</w:t>
-      </w:r>
-      <w:r>
-        <w:rPr>
-          <w:i/>
-          <w:iCs/>
-          <w:color w:val="000000"/>
-          <w:sz w:val="18"/>
-          <w:szCs w:val="18"/>
-        </w:rPr>
-        <w:t xml:space="preserve">	Oct 2025 - Present</w:t>
-      </w:r>
-    </w:p>
-    <w:p>
-      <w:pPr>
-        <w:pStyle w:val="ListParagraph"/>
-        <w:numPr>
-          <w:ilvl w:val="0"/>
-          <w:numId w:val="2"/>
-        </w:numPr>
-        <w:spacing w:after="40"/>
-      </w:pPr>
-      <w:r>
-        <w:rPr>
-          <w:color w:val="000000"/>
-          <w:sz w:val="19"/>
-          <w:szCs w:val="19"/>
-        </w:rPr>
-        <w:t xml:space="preserve">Lead technical operations for CSC's R&amp;D division and CTF competition infrastructure.</w:t>
-      </w:r>
-    </w:p>
-    <w:p>
-      <w:pPr>
-        <w:pStyle w:val="ListParagraph"/>
-        <w:numPr>
-          <w:ilvl w:val="0"/>
-          <w:numId w:val="2"/>
-        </w:numPr>
-        <w:spacing w:after="40"/>
-      </w:pPr>
-      <w:r>
-        <w:rPr>
-          <w:color w:val="000000"/>
-          <w:sz w:val="19"/>
-          <w:szCs w:val="19"/>
-        </w:rPr>
-        <w:t xml:space="preserve">Architected an automated CI/CD pipeline (GitHub Actions + ctfcli + Docker/VPS) for CSC CTF 2026, eliminating manual deployment on competition day.</w:t>
-      </w:r>
-    </w:p>
-    <w:p>
-      <w:pPr>
-        <w:pStyle w:val="ListParagraph"/>
-        <w:numPr>
-          <w:ilvl w:val="0"/>
-          <w:numId w:val="2"/>
-        </w:numPr>
-        <w:spacing w:after="40"/>
-      </w:pPr>
-      <w:r>
-        <w:rPr>
-          <w:color w:val="000000"/>
-          <w:sz w:val="19"/>
-          <w:szCs w:val="19"/>
-        </w:rPr>
-        <w:t xml:space="preserve">Coordinate 20+ challenge authors across 6 categories; review 79 pull requests, authoring 128 of 285 total commits (45%).</w:t>
-      </w:r>
-    </w:p>
-    <w:p>
-      <w:pPr>
-        <w:pStyle w:val="ListParagraph"/>
-        <w:numPr>
-          <w:ilvl w:val="0"/>
-          <w:numId w:val="2"/>
-        </w:numPr>
-        <w:spacing w:after="40"/>
-      </w:pPr>
-      <w:r>
-        <w:rPr>
-          <w:color w:val="000000"/>
-          <w:sz w:val="19"/>
-          <w:szCs w:val="19"/>
-        </w:rPr>
-        <w:t xml:space="preserve">Deliver hands-on workshops on volatile memory forensics and Windows event log triage.</w:t>
-      </w:r>
-    </w:p>
-    <w:p>
-      <w:pPr>
-        <w:spacing w:after="6" w:before="100"/>
-      </w:pPr>
-      <w:r>
-        <w:rPr>
-          <w:b/>
-          <w:bCs/>
-          <w:color w:val="000000"/>
-          <w:sz w:val="20"/>
-          <w:szCs w:val="20"/>
-        </w:rPr>
-        <w:t xml:space="preserve">Project Officer (PIC), National Cyber Week 2025</w:t>
-      </w:r>
-    </w:p>
-    <w:p>
-      <w:pPr>
-        <w:tabs>
-          <w:tab w:val="right" w:pos="11000"/>
-        </w:tabs>
-        <w:spacing w:after="30"/>
-      </w:pPr>
-      <w:r>
-        <w:rPr>
-          <w:i/>
-          <w:iCs/>
-          <w:color w:val="000000"/>
-          <w:sz w:val="18"/>
-          <w:szCs w:val="18"/>
-        </w:rPr>
-        <w:t xml:space="preserve">Cyber Security Community (CSC), BINUS University</w:t>
-      </w:r>
-      <w:r>
-        <w:rPr>
-          <w:i/>
-          <w:iCs/>
-          <w:color w:val="000000"/>
-          <w:sz w:val="18"/>
-          <w:szCs w:val="18"/>
-        </w:rPr>
         <w:t xml:space="preserve">	Oct 2025 - Dec 2025</w:t>
       </w:r>
     </w:p>
@@ -739,25 +627,25 @@
           <w:sz w:val="19"/>
           <w:szCs w:val="19"/>
         </w:rPr>
-        <w:t xml:space="preserve">Led organization of a flagship national event with student participants from UI, ITS, UNDIP, and other universities.</w:t>
-      </w:r>
-    </w:p>
-    <w:p>
-      <w:pPr>
-        <w:pStyle w:val="ListParagraph"/>
-        <w:numPr>
-          <w:ilvl w:val="0"/>
-          <w:numId w:val="2"/>
-        </w:numPr>
-        <w:spacing w:after="40"/>
-      </w:pPr>
-      <w:r>
-        <w:rPr>
-          <w:color w:val="000000"/>
-          <w:sz w:val="19"/>
-          <w:szCs w:val="19"/>
-        </w:rPr>
-        <w:t xml:space="preserve">Pioneered Indonesia's first on-site IoT Hacking CTF final round, preceded by an online Jeopardy qualifier via CTFd.</w:t>
+        <w:t xml:space="preserve">Spearheaded the organization of a flagship national cybersecurity event engaging 200+ university delegates across Indonesia (UI, ITS, UNDIP, etc.).</w:t>
+      </w:r>
+    </w:p>
+    <w:p>
+      <w:pPr>
+        <w:pStyle w:val="ListParagraph"/>
+        <w:numPr>
+          <w:ilvl w:val="0"/>
+          <w:numId w:val="2"/>
+        </w:numPr>
+        <w:spacing w:after="40"/>
+      </w:pPr>
+      <w:r>
+        <w:rPr>
+          <w:color w:val="000000"/>
+          <w:sz w:val="19"/>
+          <w:szCs w:val="19"/>
+        </w:rPr>
+        <w:t xml:space="preserve">Directed Indonesia's first on-site IoT Hacking CTF final round, preceded by an online Jeopardy qualification round hosted on CTFd.</w:t>
       </w:r>
     </w:p>
     <w:p>
@@ -1211,7 +1099,7 @@
           <w:sz w:val="19"/>
           <w:szCs w:val="19"/>
         </w:rPr>
-        <w:t xml:space="preserve">GEMASTIK CTF 2025 (Kemendikbudristek/Puspresnas - UNNES)  |  FindIT! CTF 2025 (UGM)  |  Wreck-IT CTF 2025 (BSSN)  |  PETIR REGEN26 2026  |  Gundar CTF 2025 (Universitas Gunadarma)  |  Polri Cyber CTF 2026</w:t>
+        <w:t xml:space="preserve">Competed across premier national CTFs: GEMASTIK CTF 2025 (Kemendikbudristek/Puspresnas)  |  FindIT! CTF 2025 (UGM)  |  Wreck-IT CTF 2025 (BSSN)  |  Polri Cyber CTF 2026  |  Gundar CTF 2025  |  PETIR REGEN26 2026</w:t>
       </w:r>
     </w:p>
     <w:sectPr>

</xml_diff>

<commit_message>
feat(projects): add SafeShare-AI as #1 flagship project, remove NTFS timestomping, and retain PulmoAI
</commit_message>
<xml_diff>
--- a/public/CV_Ahmad_Rafi_Sutanto.docx
+++ b/public/CV_Ahmad_Rafi_Sutanto.docx
@@ -776,6 +776,72 @@
           <w:sz w:val="20"/>
           <w:szCs w:val="20"/>
         </w:rPr>
+        <w:t xml:space="preserve">SafeShare-AI - Zero-Knowledge Privacy Guard for GenAI</w:t>
+      </w:r>
+    </w:p>
+    <w:p>
+      <w:pPr>
+        <w:spacing w:after="30"/>
+      </w:pPr>
+      <w:r>
+        <w:rPr>
+          <w:i/>
+          <w:iCs/>
+          <w:color w:val="000000"/>
+          <w:sz w:val="17"/>
+          <w:szCs w:val="17"/>
+        </w:rPr>
+        <w:t xml:space="preserve">TypeScript, WebCrypto AES-256-GCM, Manifest V3, Cloudflare Edge</w:t>
+      </w:r>
+      <w:r>
+        <w:rPr>
+          <w:color w:val="000000"/>
+          <w:sz w:val="17"/>
+          <w:szCs w:val="17"/>
+        </w:rPr>
+        <w:t xml:space="preserve">  |  </w:t>
+      </w:r>
+      <w:r>
+        <w:rPr>
+          <w:i/>
+          <w:iCs/>
+          <w:color w:val="000000"/>
+          <w:sz w:val="17"/>
+          <w:szCs w:val="17"/>
+        </w:rPr>
+        <w:t xml:space="preserve">Black Hat Asia 2027 Arsenal (Private Research)</w:t>
+      </w:r>
+    </w:p>
+    <w:p>
+      <w:pPr>
+        <w:pStyle w:val="ListParagraph"/>
+        <w:numPr>
+          <w:ilvl w:val="0"/>
+          <w:numId w:val="2"/>
+        </w:numPr>
+        <w:spacing w:after="40"/>
+      </w:pPr>
+      <w:r>
+        <w:rPr>
+          <w:color w:val="000000"/>
+          <w:sz w:val="19"/>
+          <w:szCs w:val="19"/>
+        </w:rPr>
+        <w:t xml:space="preserve">Engineered a client-side zero-knowledge browser extension with multi-tier DLP and WebCrypto AES-256-GCM encryption, preventing enterprise PII exfiltration and mathematical data deduction across major LLM platforms.</w:t>
+      </w:r>
+    </w:p>
+    <w:p>
+      <w:pPr>
+        <w:spacing w:after="6" w:before="100"/>
+      </w:pPr>
+      <w:r>
+        <w:rPr>
+          <w:b/>
+          <w:bCs/>
+          <w:color w:val="000000"/>
+          <w:sz w:val="20"/>
+          <w:szCs w:val="20"/>
+        </w:rPr>
         <w:t xml:space="preserve">CSC CTF Contest 2026 - Automated CI/CD Platform</w:t>
       </w:r>
     </w:p>
@@ -896,54 +962,6 @@
           <w:szCs w:val="19"/>
         </w:rPr>
         <w:t xml:space="preserve">Supply-chain attack simulation on Arch Linux with a multi-layer forensic trail: ALPM logs, persistence mechanisms, memory artifacts, and xattr encryption flags.</w:t>
-      </w:r>
-    </w:p>
-    <w:p>
-      <w:pPr>
-        <w:spacing w:after="6" w:before="100"/>
-      </w:pPr>
-      <w:r>
-        <w:rPr>
-          <w:b/>
-          <w:bCs/>
-          <w:color w:val="000000"/>
-          <w:sz w:val="20"/>
-          <w:szCs w:val="20"/>
-        </w:rPr>
-        <w:t xml:space="preserve">Detection &amp; Forensic Reconstruction of NTFS Timestomping (Research)</w:t>
-      </w:r>
-    </w:p>
-    <w:p>
-      <w:pPr>
-        <w:spacing w:after="30"/>
-      </w:pPr>
-      <w:r>
-        <w:rPr>
-          <w:i/>
-          <w:iCs/>
-          <w:color w:val="000000"/>
-          <w:sz w:val="17"/>
-          <w:szCs w:val="17"/>
-        </w:rPr>
-        <w:t xml:space="preserve">Windows 11, USN Journal, $MFT, EVTX Correlation</w:t>
-      </w:r>
-    </w:p>
-    <w:p>
-      <w:pPr>
-        <w:pStyle w:val="ListParagraph"/>
-        <w:numPr>
-          <w:ilvl w:val="0"/>
-          <w:numId w:val="2"/>
-        </w:numPr>
-        <w:spacing w:after="40"/>
-      </w:pPr>
-      <w:r>
-        <w:rPr>
-          <w:color w:val="000000"/>
-          <w:sz w:val="19"/>
-          <w:szCs w:val="19"/>
-        </w:rPr>
-        <w:t xml:space="preserve">Researching detection of anti-forensic NTFS timestamp manipulation ($STANDARD_INFORMATION vs. $FILE_NAME) via cross-artifact temporal correlation.</w:t>
       </w:r>
     </w:p>
     <w:p>

</xml_diff>

<commit_message>
refactor(cv): refine phrasing to eliminate AI tone, remove Black Hat references, and prune redundant bullets
</commit_message>
<xml_diff>
--- a/public/CV_Ahmad_Rafi_Sutanto.docx
+++ b/public/CV_Ahmad_Rafi_Sutanto.docx
@@ -415,43 +415,7 @@
           <w:sz w:val="19"/>
           <w:szCs w:val="19"/>
         </w:rPr>
-        <w:t xml:space="preserve">Conduct advanced threat detection, network threat hunting, and data-exfiltration triage alongside senior security researchers.</w:t>
-      </w:r>
-    </w:p>
-    <w:p>
-      <w:pPr>
-        <w:pStyle w:val="ListParagraph"/>
-        <w:numPr>
-          <w:ilvl w:val="0"/>
-          <w:numId w:val="2"/>
-        </w:numPr>
-        <w:spacing w:after="40"/>
-      </w:pPr>
-      <w:r>
-        <w:rPr>
-          <w:color w:val="000000"/>
-          <w:sz w:val="19"/>
-          <w:szCs w:val="19"/>
-        </w:rPr>
         <w:t xml:space="preserve">Designed and validated multi-stage forensic challenges for national competitions (IFEST 2026 UNPAD &amp; BeeCTF 2026), simulating encrypted LUKS partitions, ext4 unallocated-block data carving, Linux PAM exploitation, and Arch Linux AUR supply-chain compromises.</w:t>
-      </w:r>
-    </w:p>
-    <w:p>
-      <w:pPr>
-        <w:pStyle w:val="ListParagraph"/>
-        <w:numPr>
-          <w:ilvl w:val="0"/>
-          <w:numId w:val="2"/>
-        </w:numPr>
-        <w:spacing w:after="40"/>
-      </w:pPr>
-      <w:r>
-        <w:rPr>
-          <w:color w:val="000000"/>
-          <w:sz w:val="19"/>
-          <w:szCs w:val="19"/>
-        </w:rPr>
-        <w:t xml:space="preserve">Authored comprehensive investigation writeups and automated solver/validation harnesses detailing dual-path analysis via CLI (Linux/WSL) and GUI forensics tools (FTK Imager).</w:t>
       </w:r>
     </w:p>
     <w:p>
@@ -553,24 +517,6 @@
     </w:p>
     <w:p>
       <w:pPr>
-        <w:pStyle w:val="ListParagraph"/>
-        <w:numPr>
-          <w:ilvl w:val="0"/>
-          <w:numId w:val="2"/>
-        </w:numPr>
-        <w:spacing w:after="40"/>
-      </w:pPr>
-      <w:r>
-        <w:rPr>
-          <w:color w:val="000000"/>
-          <w:sz w:val="19"/>
-          <w:szCs w:val="19"/>
-        </w:rPr>
-        <w:t xml:space="preserve">Deliver hands-on workshops on volatile memory forensics and Windows event log triage.</w:t>
-      </w:r>
-    </w:p>
-    <w:p>
-      <w:pPr>
         <w:spacing w:after="6" w:before="100"/>
       </w:pPr>
       <w:r>
@@ -627,43 +573,43 @@
           <w:sz w:val="19"/>
           <w:szCs w:val="19"/>
         </w:rPr>
-        <w:t xml:space="preserve">Spearheaded the organization of a flagship national cybersecurity event engaging 200+ university delegates across Indonesia (UI, ITS, UNDIP, etc.).</w:t>
-      </w:r>
-    </w:p>
-    <w:p>
-      <w:pPr>
-        <w:pStyle w:val="ListParagraph"/>
-        <w:numPr>
-          <w:ilvl w:val="0"/>
-          <w:numId w:val="2"/>
-        </w:numPr>
-        <w:spacing w:after="40"/>
-      </w:pPr>
-      <w:r>
-        <w:rPr>
-          <w:color w:val="000000"/>
-          <w:sz w:val="19"/>
-          <w:szCs w:val="19"/>
-        </w:rPr>
-        <w:t xml:space="preserve">Directed Indonesia's first on-site IoT Hacking CTF final round, preceded by an online Jeopardy qualification round hosted on CTFd.</w:t>
-      </w:r>
-    </w:p>
-    <w:p>
-      <w:pPr>
-        <w:pStyle w:val="ListParagraph"/>
-        <w:numPr>
-          <w:ilvl w:val="0"/>
-          <w:numId w:val="2"/>
-        </w:numPr>
-        <w:spacing w:after="40"/>
-      </w:pPr>
-      <w:r>
-        <w:rPr>
-          <w:color w:val="000000"/>
-          <w:sz w:val="19"/>
-          <w:szCs w:val="19"/>
-        </w:rPr>
-        <w:t xml:space="preserve">Curated workshops on Web Penetration Testing (OWASP/WSTG/OSINT) and Adversarial AI/ML Red Teaming.</w:t>
+        <w:t xml:space="preserve">Managed event operations and committee for National Cyber Week 2025, hosting 200+ student participants from universities across Indonesia.</w:t>
+      </w:r>
+    </w:p>
+    <w:p>
+      <w:pPr>
+        <w:pStyle w:val="ListParagraph"/>
+        <w:numPr>
+          <w:ilvl w:val="0"/>
+          <w:numId w:val="2"/>
+        </w:numPr>
+        <w:spacing w:after="40"/>
+      </w:pPr>
+      <w:r>
+        <w:rPr>
+          <w:color w:val="000000"/>
+          <w:sz w:val="19"/>
+          <w:szCs w:val="19"/>
+        </w:rPr>
+        <w:t xml:space="preserve">Organized the on-site IoT Hacking CTF final round at BINUS Anggrek, preceded by an online CTFd qualification stage.</w:t>
+      </w:r>
+    </w:p>
+    <w:p>
+      <w:pPr>
+        <w:pStyle w:val="ListParagraph"/>
+        <w:numPr>
+          <w:ilvl w:val="0"/>
+          <w:numId w:val="2"/>
+        </w:numPr>
+        <w:spacing w:after="40"/>
+      </w:pPr>
+      <w:r>
+        <w:rPr>
+          <w:color w:val="000000"/>
+          <w:sz w:val="19"/>
+          <w:szCs w:val="19"/>
+        </w:rPr>
+        <w:t xml:space="preserve">Coordinated technical workshops on Web Penetration Testing (OWASP) and Adversarial AI/ML security.</w:t>
       </w:r>
     </w:p>
     <w:p>
@@ -729,24 +675,6 @@
     </w:p>
     <w:p>
       <w:pPr>
-        <w:pStyle w:val="ListParagraph"/>
-        <w:numPr>
-          <w:ilvl w:val="0"/>
-          <w:numId w:val="2"/>
-        </w:numPr>
-        <w:spacing w:after="40"/>
-      </w:pPr>
-      <w:r>
-        <w:rPr>
-          <w:color w:val="000000"/>
-          <w:sz w:val="19"/>
-          <w:szCs w:val="19"/>
-        </w:rPr>
-        <w:t xml:space="preserve">Mentored new members on the Volatility and Wireshark toolchains.</w:t>
-      </w:r>
-    </w:p>
-    <w:p>
-      <w:pPr>
         <w:pBdr>
           <w:bottom w:val="single" w:color="000000" w:sz="4" w:space="2"/>
         </w:pBdr>
@@ -809,25 +737,25 @@
           <w:sz w:val="17"/>
           <w:szCs w:val="17"/>
         </w:rPr>
-        <w:t xml:space="preserve">Black Hat Asia 2027 Arsenal (Private Research)</w:t>
-      </w:r>
-    </w:p>
-    <w:p>
-      <w:pPr>
-        <w:pStyle w:val="ListParagraph"/>
-        <w:numPr>
-          <w:ilvl w:val="0"/>
-          <w:numId w:val="2"/>
-        </w:numPr>
-        <w:spacing w:after="40"/>
-      </w:pPr>
-      <w:r>
-        <w:rPr>
-          <w:color w:val="000000"/>
-          <w:sz w:val="19"/>
-          <w:szCs w:val="19"/>
-        </w:rPr>
-        <w:t xml:space="preserve">Engineered a client-side zero-knowledge browser extension with multi-tier DLP and WebCrypto AES-256-GCM encryption, preventing enterprise PII exfiltration and mathematical data deduction across major LLM platforms.</w:t>
+        <w:t xml:space="preserve">github.com/darflashxd/safeshare</w:t>
+      </w:r>
+    </w:p>
+    <w:p>
+      <w:pPr>
+        <w:pStyle w:val="ListParagraph"/>
+        <w:numPr>
+          <w:ilvl w:val="0"/>
+          <w:numId w:val="2"/>
+        </w:numPr>
+        <w:spacing w:after="40"/>
+      </w:pPr>
+      <w:r>
+        <w:rPr>
+          <w:color w:val="000000"/>
+          <w:sz w:val="19"/>
+          <w:szCs w:val="19"/>
+        </w:rPr>
+        <w:t xml:space="preserve">Built a browser extension (Chrome/Firefox MV3) that detects and redacts sensitive PII (NIK, credit cards, API keys) before generating public AI share links, encrypting chats client-side via WebCrypto AES-256-GCM.</w:t>
       </w:r>
     </w:p>
     <w:p>

</xml_diff>

<commit_message>
style(cv): unify typography to 100% Calibri across all sections
</commit_message>
<xml_diff>
--- a/public/CV_Ahmad_Rafi_Sutanto.docx
+++ b/public/CV_Ahmad_Rafi_Sutanto.docx
@@ -1252,7 +1252,14 @@
 <file path=word/styles.xml><?xml version="1.0" encoding="utf-8"?>
 <w:styles xmlns:mc="http://schemas.openxmlformats.org/markup-compatibility/2006" xmlns:r="http://schemas.openxmlformats.org/officeDocument/2006/relationships" xmlns:w="http://schemas.openxmlformats.org/wordprocessingml/2006/main" xmlns:w14="http://schemas.microsoft.com/office/word/2010/wordml" xmlns:w15="http://schemas.microsoft.com/office/word/2012/wordml" mc:Ignorable="w14 w15">
   <w:docDefaults>
-    <w:rPrDefault/>
+    <w:rPrDefault>
+      <w:rPr>
+        <w:rFonts w:ascii="Calibri" w:hAnsi="Calibri" w:cs="Calibri"/>
+        <w:color w:val="000000"/>
+        <w:sz w:val="19"/>
+        <w:szCs w:val="19"/>
+      </w:rPr>
+    </w:rPrDefault>
     <w:pPrDefault/>
   </w:docDefaults>
   <w:style w:type="paragraph" w:styleId="Title">

</xml_diff>

<commit_message>
style(cv): remove all bold styling for uniform regular typography
</commit_message>
<xml_diff>
--- a/public/CV_Ahmad_Rafi_Sutanto.docx
+++ b/public/CV_Ahmad_Rafi_Sutanto.docx
@@ -10,8 +10,6 @@
       <w:r>
         <w:rPr>
           <w:rFonts w:ascii="Calibri" w:cs="Calibri" w:eastAsia="Calibri" w:hAnsi="Calibri"/>
-          <w:b/>
-          <w:bCs/>
           <w:color w:val="000000"/>
           <w:sz w:val="40"/>
           <w:szCs w:val="40"/>
@@ -111,8 +109,6 @@
       <w:r>
         <w:rPr>
           <w:rFonts w:ascii="Calibri" w:cs="Calibri" w:eastAsia="Calibri" w:hAnsi="Calibri"/>
-          <w:b/>
-          <w:bCs/>
           <w:color w:val="000000"/>
           <w:sz w:val="21"/>
           <w:szCs w:val="21"/>
@@ -145,8 +141,6 @@
       <w:r>
         <w:rPr>
           <w:rFonts w:ascii="Calibri" w:cs="Calibri" w:eastAsia="Calibri" w:hAnsi="Calibri"/>
-          <w:b/>
-          <w:bCs/>
           <w:color w:val="000000"/>
           <w:sz w:val="21"/>
           <w:szCs w:val="21"/>
@@ -163,8 +157,6 @@
       </w:pPr>
       <w:r>
         <w:rPr>
-          <w:b/>
-          <w:bCs/>
           <w:color w:val="000000"/>
           <w:sz w:val="20"/>
           <w:szCs w:val="20"/>
@@ -217,8 +209,6 @@
       <w:r>
         <w:rPr>
           <w:rFonts w:ascii="Calibri" w:cs="Calibri" w:eastAsia="Calibri" w:hAnsi="Calibri"/>
-          <w:b/>
-          <w:bCs/>
           <w:color w:val="000000"/>
           <w:sz w:val="21"/>
           <w:szCs w:val="21"/>
@@ -237,8 +227,6 @@
       </w:pPr>
       <w:r>
         <w:rPr>
-          <w:b/>
-          <w:bCs/>
           <w:color w:val="000000"/>
           <w:sz w:val="19"/>
           <w:szCs w:val="19"/>
@@ -265,8 +253,6 @@
       </w:pPr>
       <w:r>
         <w:rPr>
-          <w:b/>
-          <w:bCs/>
           <w:color w:val="000000"/>
           <w:sz w:val="19"/>
           <w:szCs w:val="19"/>
@@ -293,8 +279,6 @@
       </w:pPr>
       <w:r>
         <w:rPr>
-          <w:b/>
-          <w:bCs/>
           <w:color w:val="000000"/>
           <w:sz w:val="19"/>
           <w:szCs w:val="19"/>
@@ -321,8 +305,6 @@
       </w:pPr>
       <w:r>
         <w:rPr>
-          <w:b/>
-          <w:bCs/>
           <w:color w:val="000000"/>
           <w:sz w:val="19"/>
           <w:szCs w:val="19"/>
@@ -348,8 +330,6 @@
       <w:r>
         <w:rPr>
           <w:rFonts w:ascii="Calibri" w:cs="Calibri" w:eastAsia="Calibri" w:hAnsi="Calibri"/>
-          <w:b/>
-          <w:bCs/>
           <w:color w:val="000000"/>
           <w:sz w:val="21"/>
           <w:szCs w:val="21"/>
@@ -363,8 +343,6 @@
       </w:pPr>
       <w:r>
         <w:rPr>
-          <w:b/>
-          <w:bCs/>
           <w:color w:val="000000"/>
           <w:sz w:val="20"/>
           <w:szCs w:val="20"/>
@@ -424,8 +402,6 @@
       </w:pPr>
       <w:r>
         <w:rPr>
-          <w:b/>
-          <w:bCs/>
           <w:color w:val="000000"/>
           <w:sz w:val="20"/>
           <w:szCs w:val="20"/>
@@ -521,8 +497,6 @@
       </w:pPr>
       <w:r>
         <w:rPr>
-          <w:b/>
-          <w:bCs/>
           <w:color w:val="000000"/>
           <w:sz w:val="20"/>
           <w:szCs w:val="20"/>
@@ -618,8 +592,6 @@
       </w:pPr>
       <w:r>
         <w:rPr>
-          <w:b/>
-          <w:bCs/>
           <w:color w:val="000000"/>
           <w:sz w:val="20"/>
           <w:szCs w:val="20"/>
@@ -683,8 +655,6 @@
       <w:r>
         <w:rPr>
           <w:rFonts w:ascii="Calibri" w:cs="Calibri" w:eastAsia="Calibri" w:hAnsi="Calibri"/>
-          <w:b/>
-          <w:bCs/>
           <w:color w:val="000000"/>
           <w:sz w:val="21"/>
           <w:szCs w:val="21"/>
@@ -698,8 +668,6 @@
       </w:pPr>
       <w:r>
         <w:rPr>
-          <w:b/>
-          <w:bCs/>
           <w:color w:val="000000"/>
           <w:sz w:val="20"/>
           <w:szCs w:val="20"/>
@@ -764,8 +732,6 @@
       </w:pPr>
       <w:r>
         <w:rPr>
-          <w:b/>
-          <w:bCs/>
           <w:color w:val="000000"/>
           <w:sz w:val="20"/>
           <w:szCs w:val="20"/>
@@ -831,8 +797,6 @@
       </w:pPr>
       <w:r>
         <w:rPr>
-          <w:b/>
-          <w:bCs/>
           <w:color w:val="000000"/>
           <w:sz w:val="20"/>
           <w:szCs w:val="20"/>
@@ -898,8 +862,6 @@
       </w:pPr>
       <w:r>
         <w:rPr>
-          <w:b/>
-          <w:bCs/>
           <w:color w:val="000000"/>
           <w:sz w:val="20"/>
           <w:szCs w:val="20"/>
@@ -969,8 +931,6 @@
       <w:r>
         <w:rPr>
           <w:rFonts w:ascii="Calibri" w:cs="Calibri" w:eastAsia="Calibri" w:hAnsi="Calibri"/>
-          <w:b/>
-          <w:bCs/>
           <w:color w:val="000000"/>
           <w:sz w:val="21"/>
           <w:szCs w:val="21"/>
@@ -1024,8 +984,6 @@
       <w:r>
         <w:rPr>
           <w:rFonts w:ascii="Calibri" w:cs="Calibri" w:eastAsia="Calibri" w:hAnsi="Calibri"/>
-          <w:b/>
-          <w:bCs/>
           <w:color w:val="000000"/>
           <w:sz w:val="21"/>
           <w:szCs w:val="21"/>
@@ -1339,10 +1297,7 @@
     <w:basedOn w:val="Normal"/>
     <w:next w:val="Normal"/>
     <w:qFormat/>
-    <w:rPr>
-      <w:b/>
-      <w:bCs/>
-    </w:rPr>
+    <w:rPr/>
   </w:style>
   <w:style w:type="paragraph" w:styleId="ListParagraph">
     <w:name w:val="List Paragraph"/>

</xml_diff>

<commit_message>
revert(cv): restore professional bold typography on headings and roles
</commit_message>
<xml_diff>
--- a/public/CV_Ahmad_Rafi_Sutanto.docx
+++ b/public/CV_Ahmad_Rafi_Sutanto.docx
@@ -10,6 +10,8 @@
       <w:r>
         <w:rPr>
           <w:rFonts w:ascii="Calibri" w:cs="Calibri" w:eastAsia="Calibri" w:hAnsi="Calibri"/>
+          <w:b/>
+          <w:bCs/>
           <w:color w:val="000000"/>
           <w:sz w:val="40"/>
           <w:szCs w:val="40"/>
@@ -109,6 +111,8 @@
       <w:r>
         <w:rPr>
           <w:rFonts w:ascii="Calibri" w:cs="Calibri" w:eastAsia="Calibri" w:hAnsi="Calibri"/>
+          <w:b/>
+          <w:bCs/>
           <w:color w:val="000000"/>
           <w:sz w:val="21"/>
           <w:szCs w:val="21"/>
@@ -141,6 +145,8 @@
       <w:r>
         <w:rPr>
           <w:rFonts w:ascii="Calibri" w:cs="Calibri" w:eastAsia="Calibri" w:hAnsi="Calibri"/>
+          <w:b/>
+          <w:bCs/>
           <w:color w:val="000000"/>
           <w:sz w:val="21"/>
           <w:szCs w:val="21"/>
@@ -157,6 +163,8 @@
       </w:pPr>
       <w:r>
         <w:rPr>
+          <w:b/>
+          <w:bCs/>
           <w:color w:val="000000"/>
           <w:sz w:val="20"/>
           <w:szCs w:val="20"/>
@@ -209,6 +217,8 @@
       <w:r>
         <w:rPr>
           <w:rFonts w:ascii="Calibri" w:cs="Calibri" w:eastAsia="Calibri" w:hAnsi="Calibri"/>
+          <w:b/>
+          <w:bCs/>
           <w:color w:val="000000"/>
           <w:sz w:val="21"/>
           <w:szCs w:val="21"/>
@@ -227,6 +237,8 @@
       </w:pPr>
       <w:r>
         <w:rPr>
+          <w:b/>
+          <w:bCs/>
           <w:color w:val="000000"/>
           <w:sz w:val="19"/>
           <w:szCs w:val="19"/>
@@ -253,6 +265,8 @@
       </w:pPr>
       <w:r>
         <w:rPr>
+          <w:b/>
+          <w:bCs/>
           <w:color w:val="000000"/>
           <w:sz w:val="19"/>
           <w:szCs w:val="19"/>
@@ -279,6 +293,8 @@
       </w:pPr>
       <w:r>
         <w:rPr>
+          <w:b/>
+          <w:bCs/>
           <w:color w:val="000000"/>
           <w:sz w:val="19"/>
           <w:szCs w:val="19"/>
@@ -305,6 +321,8 @@
       </w:pPr>
       <w:r>
         <w:rPr>
+          <w:b/>
+          <w:bCs/>
           <w:color w:val="000000"/>
           <w:sz w:val="19"/>
           <w:szCs w:val="19"/>
@@ -330,6 +348,8 @@
       <w:r>
         <w:rPr>
           <w:rFonts w:ascii="Calibri" w:cs="Calibri" w:eastAsia="Calibri" w:hAnsi="Calibri"/>
+          <w:b/>
+          <w:bCs/>
           <w:color w:val="000000"/>
           <w:sz w:val="21"/>
           <w:szCs w:val="21"/>
@@ -343,6 +363,8 @@
       </w:pPr>
       <w:r>
         <w:rPr>
+          <w:b/>
+          <w:bCs/>
           <w:color w:val="000000"/>
           <w:sz w:val="20"/>
           <w:szCs w:val="20"/>
@@ -402,6 +424,8 @@
       </w:pPr>
       <w:r>
         <w:rPr>
+          <w:b/>
+          <w:bCs/>
           <w:color w:val="000000"/>
           <w:sz w:val="20"/>
           <w:szCs w:val="20"/>
@@ -497,6 +521,8 @@
       </w:pPr>
       <w:r>
         <w:rPr>
+          <w:b/>
+          <w:bCs/>
           <w:color w:val="000000"/>
           <w:sz w:val="20"/>
           <w:szCs w:val="20"/>
@@ -592,6 +618,8 @@
       </w:pPr>
       <w:r>
         <w:rPr>
+          <w:b/>
+          <w:bCs/>
           <w:color w:val="000000"/>
           <w:sz w:val="20"/>
           <w:szCs w:val="20"/>
@@ -655,6 +683,8 @@
       <w:r>
         <w:rPr>
           <w:rFonts w:ascii="Calibri" w:cs="Calibri" w:eastAsia="Calibri" w:hAnsi="Calibri"/>
+          <w:b/>
+          <w:bCs/>
           <w:color w:val="000000"/>
           <w:sz w:val="21"/>
           <w:szCs w:val="21"/>
@@ -668,6 +698,8 @@
       </w:pPr>
       <w:r>
         <w:rPr>
+          <w:b/>
+          <w:bCs/>
           <w:color w:val="000000"/>
           <w:sz w:val="20"/>
           <w:szCs w:val="20"/>
@@ -732,6 +764,8 @@
       </w:pPr>
       <w:r>
         <w:rPr>
+          <w:b/>
+          <w:bCs/>
           <w:color w:val="000000"/>
           <w:sz w:val="20"/>
           <w:szCs w:val="20"/>
@@ -797,6 +831,8 @@
       </w:pPr>
       <w:r>
         <w:rPr>
+          <w:b/>
+          <w:bCs/>
           <w:color w:val="000000"/>
           <w:sz w:val="20"/>
           <w:szCs w:val="20"/>
@@ -862,6 +898,8 @@
       </w:pPr>
       <w:r>
         <w:rPr>
+          <w:b/>
+          <w:bCs/>
           <w:color w:val="000000"/>
           <w:sz w:val="20"/>
           <w:szCs w:val="20"/>
@@ -931,6 +969,8 @@
       <w:r>
         <w:rPr>
           <w:rFonts w:ascii="Calibri" w:cs="Calibri" w:eastAsia="Calibri" w:hAnsi="Calibri"/>
+          <w:b/>
+          <w:bCs/>
           <w:color w:val="000000"/>
           <w:sz w:val="21"/>
           <w:szCs w:val="21"/>
@@ -984,6 +1024,8 @@
       <w:r>
         <w:rPr>
           <w:rFonts w:ascii="Calibri" w:cs="Calibri" w:eastAsia="Calibri" w:hAnsi="Calibri"/>
+          <w:b/>
+          <w:bCs/>
           <w:color w:val="000000"/>
           <w:sz w:val="21"/>
           <w:szCs w:val="21"/>
@@ -1297,7 +1339,10 @@
     <w:basedOn w:val="Normal"/>
     <w:next w:val="Normal"/>
     <w:qFormat/>
-    <w:rPr/>
+    <w:rPr>
+      <w:b/>
+      <w:bCs/>
+    </w:rPr>
   </w:style>
   <w:style w:type="paragraph" w:styleId="ListParagraph">
     <w:name w:val="List Paragraph"/>

</xml_diff>

<commit_message>
CV v3: expand skills, add PulmoAI, strengthen bullets per ATS research
</commit_message>
<xml_diff>
--- a/public/CV_Ahmad_Rafi_Sutanto.docx
+++ b/public/CV_Ahmad_Rafi_Sutanto.docx
@@ -9,7 +9,7 @@
       <w:r>
         <w:rPr>
           <w:b/>
-          <w:sz w:val="36"/>
+          <w:sz w:val="32"/>
         </w:rPr>
         <w:t>AHMAD RAFI SUTANTO</w:t>
       </w:r>
@@ -32,7 +32,7 @@
     </w:p>
     <w:p>
       <w:pPr>
-        <w:spacing w:before="140"/>
+        <w:spacing w:before="100"/>
       </w:pPr>
       <w:r>
         <w:rPr>
@@ -43,12 +43,12 @@
     </w:p>
     <w:p>
       <w:r>
-        <w:t>Cybersecurity undergraduate at BINUS University with hands-on experience developing forensic challenges, building privacy tools, and automating CTF infrastructure. Seeking an internship in digital forensics, security operations, or defensive security tooling.</w:t>
+        <w:t>Cybersecurity undergraduate at BINUS University with hands-on experience in digital forensics challenge authoring, privacy tooling development, and CTF infrastructure automation. Finalist at Wreck-IT 7.0 national cyber competition. Seeking an internship in digital forensics, security operations, or defensive security engineering.</w:t>
       </w:r>
     </w:p>
     <w:p>
       <w:pPr>
-        <w:spacing w:before="140"/>
+        <w:spacing w:before="100"/>
       </w:pPr>
       <w:r>
         <w:rPr>
@@ -65,7 +65,7 @@
         <w:rPr>
           <w:b/>
         </w:rPr>
-        <w:t>BINUS University | Computer Science, Cyber Security | 2024–2028 (expected)</w:t>
+        <w:t>BINUS University | B.S. Computer Science, Cyber Security | 2024–2028 (expected)</w:t>
       </w:r>
     </w:p>
     <w:p>
@@ -75,7 +75,7 @@
     </w:p>
     <w:p>
       <w:pPr>
-        <w:spacing w:before="140"/>
+        <w:spacing w:before="100"/>
       </w:pPr>
       <w:r>
         <w:rPr>
@@ -97,12 +97,12 @@
     </w:p>
     <w:p>
       <w:r>
-        <w:t>• Developed forensic challenges for IFEST 2026 and BeeCTF 2026, covering encrypted Linux volumes, filesystem carving, and a simulated malicious AUR package.</w:t>
+        <w:t>• Developed forensic challenges for IFEST 2026 (Universitas Padjadjaran) and BeeCTF 2026: LUKS volume encryption, ext4 artifact carving, and a simulated malicious Arch Linux AUR package with multi-layer evidence trails.</w:t>
       </w:r>
     </w:p>
     <w:p>
       <w:r>
-        <w:t>• Prepared reference writeups and validated intended investigation paths and solutions.</w:t>
+        <w:t>• Authored reference writeups covering both Linux CLI and FTK Imager investigation paths; built automated validation solvers to guarantee challenge integrity.</w:t>
       </w:r>
     </w:p>
     <w:p>
@@ -118,12 +118,12 @@
     </w:p>
     <w:p>
       <w:r>
-        <w:t>• Coordinate challenge authors and review contributions across competition categories.</w:t>
+        <w:t>• Coordinate challenge authors across six competition categories and review contributions for technical accuracy and solvability.</w:t>
       </w:r>
     </w:p>
     <w:p>
       <w:r>
-        <w:t>• Built GitHub Actions workflows to synchronize challenge metadata with CTFd through ctfcli and deploy Docker services to a VPS over SSH.</w:t>
+        <w:t>• Built GitHub Actions CI/CD workflows that auto-sync challenge metadata to CTFd via ctfcli and deploy Docker services to VPS over SSH, eliminating manual deployment on competition day.</w:t>
       </w:r>
     </w:p>
     <w:p>
@@ -134,12 +134,12 @@
         <w:rPr>
           <w:b/>
         </w:rPr>
-        <w:t>Project Officer | National Cyber Week, CSC BINUS | Oct–Dec 2025</w:t>
+        <w:t>Project Officer | National Cyber Week 2025, CSC BINUS | Oct–Dec 2025</w:t>
       </w:r>
     </w:p>
     <w:p>
       <w:r>
-        <w:t>• Coordinated competition operations, an on-site IoT hacking final, and workshops on web security and adversarial AI.</w:t>
+        <w:t>• Led event operations for 200+ national university participants, including an on-site IoT Hacking CTF final and workshops on web penetration testing and adversarial AI.</w:t>
       </w:r>
     </w:p>
     <w:p>
@@ -155,12 +155,12 @@
     </w:p>
     <w:p>
       <w:r>
-        <w:t>• Authored file-carving challenges for CSC CTF 2025 and supported practical learning with Volatility and Wireshark.</w:t>
+        <w:t>• Authored file-carving forensics challenges for CSC CTF 2025 and mentored junior members on Volatility and Wireshark investigation workflows.</w:t>
       </w:r>
     </w:p>
     <w:p>
       <w:pPr>
-        <w:spacing w:before="140"/>
+        <w:spacing w:before="100"/>
       </w:pPr>
       <w:r>
         <w:rPr>
@@ -177,22 +177,22 @@
         <w:rPr>
           <w:b/>
         </w:rPr>
-        <w:t>SafeShare | Privacy tooling for AI conversations</w:t>
+        <w:t>SafeShare — Privacy tooling for AI conversations</w:t>
       </w:r>
     </w:p>
     <w:p>
       <w:r>
-        <w:t>https://github.com/darflashxd/safeshare</w:t>
+        <w:t>github.com/darflashxd/safeshare</w:t>
       </w:r>
     </w:p>
     <w:p>
       <w:r>
-        <w:t>• Built a browser extension to detect and redact sensitive information in AI conversations, with a review interface for adjusting redactions before sharing.</w:t>
+        <w:t>• Built a browser extension that detects and redacts sensitive information (credentials, PII, API keys) in AI conversations, with a review interface for adjusting redactions before sharing.</w:t>
       </w:r>
     </w:p>
     <w:p>
       <w:r>
-        <w:t>• Implemented client-side AES-256-GCM encryption with WebCrypto and a sharing service using Cloudflare Workers. Available for users; development ongoing.</w:t>
+        <w:t>• Implemented client-side AES-256-GCM encryption via WebCrypto and a sharing service on Cloudflare Workers with ephemeral burn-after-reading links. Available for users; actively developed.</w:t>
       </w:r>
     </w:p>
     <w:p>
@@ -203,22 +203,43 @@
         <w:rPr>
           <w:b/>
         </w:rPr>
-        <w:t>The Poisoned AUR | BeeCTF 2026 digital forensics challenge</w:t>
+        <w:t>The Poisoned AUR — BeeCTF 2026 digital forensics challenge</w:t>
       </w:r>
     </w:p>
     <w:p>
       <w:r>
-        <w:t>https://github.com/PETIRsec/beefest-2026-qual</w:t>
+        <w:t>github.com/PETIRsec/beefest-2026-qual</w:t>
       </w:r>
     </w:p>
     <w:p>
       <w:r>
-        <w:t>• Created a simulated Arch Linux package compromise with evidence across package logs, shell history, systemd, ELF binaries, and extended attributes; documented CLI and FTK Imager investigation paths.</w:t>
+        <w:t>• Simulated an Arch Linux package compromise requiring correlation across package logs, shell history, systemd journal, ELF binaries, and extended file attributes (xattr) to reconstruct the full attack timeline.</w:t>
       </w:r>
     </w:p>
     <w:p>
       <w:pPr>
-        <w:spacing w:before="140"/>
+        <w:keepNext/>
+      </w:pPr>
+      <w:r>
+        <w:rPr>
+          <w:b/>
+        </w:rPr>
+        <w:t>PulmoAI — Tuberculosis chest X-ray detection</w:t>
+      </w:r>
+    </w:p>
+    <w:p>
+      <w:r>
+        <w:t>github.com/darflashxd/pulmoai</w:t>
+      </w:r>
+    </w:p>
+    <w:p>
+      <w:r>
+        <w:t>• Optimized CNN model from VGG to MobileNetV2 via transfer learning, reducing model size by 90% while achieving 99.65% validation accuracy. Full-stack app with Flask backend and React frontend.</w:t>
+      </w:r>
+    </w:p>
+    <w:p>
+      <w:pPr>
+        <w:spacing w:before="100"/>
       </w:pPr>
       <w:r>
         <w:rPr>
@@ -229,38 +250,69 @@
     </w:p>
     <w:p>
       <w:r>
-        <w:t>Forensics: Volatility 3, Autopsy, FTK Imager, Eric Zimmerman Tools, Wireshark; Windows/Linux artifacts</w:t>
+        <w:t>Forensics &amp; IR: Volatility 3, Autopsy, FTK Imager, Eric Zimmerman Tools, Wireshark; Windows/Linux artifact analysis</w:t>
       </w:r>
     </w:p>
     <w:p>
       <w:r>
-        <w:t>Detection: Splunk, Sysmon, Windows Event Logs | Development: Python, Bash, TypeScript, Git</w:t>
+        <w:t>Detection &amp; SIEM: Splunk, Sysmon, Windows Event Logs (EVTX), YARA Rules, Sigma Rules</w:t>
       </w:r>
     </w:p>
     <w:p>
       <w:r>
-        <w:t>Infrastructure: Linux, Docker, GitHub Actions, ctfcli | Concepts: MITRE ATT&amp;CK, incident response</w:t>
+        <w:t>Development: Python, Bash, TypeScript, Git, Docker, GitHub Actions, ctfcli</w:t>
+      </w:r>
+    </w:p>
+    <w:p>
+      <w:r>
+        <w:t>Reverse Engineering: Ghidra, x64dbg, JADX, APKTool</w:t>
+      </w:r>
+    </w:p>
+    <w:p>
+      <w:r>
+        <w:t>Frameworks: MITRE ATT&amp;CK, NIST SP 800-61, OWASP Top 10</w:t>
       </w:r>
     </w:p>
     <w:p>
       <w:pPr>
-        <w:spacing w:before="140"/>
+        <w:spacing w:before="100"/>
       </w:pPr>
       <w:r>
         <w:rPr>
           <w:b/>
         </w:rPr>
-        <w:t>AWARDS &amp; PROFESSIONAL DEVELOPMENT</w:t>
+        <w:t>AWARDS &amp; COMPETITIONS</w:t>
       </w:r>
     </w:p>
     <w:p>
       <w:r>
-        <w:t>Finalist, Wreck-IT 7.0 General CTF | Politeknik Siber dan Sandi Negara | Aug 2026 | Team HM Plenger</w:t>
+        <w:t>Finalist, Wreck-IT 7.0 General CTF | Politeknik Siber dan Sandi Negara (BSSN) | Aug 2026 | Team HM Plenger</w:t>
+      </w:r>
+    </w:p>
+    <w:p>
+      <w:r>
+        <w:t>Competitor: GEMASTIK (Kemendikbudristek), FindIT! (UGM), IFEST (UNPAD), Polri Cyber CTF, Gundar CTF | 2025–2026</w:t>
+      </w:r>
+    </w:p>
+    <w:p>
+      <w:pPr>
+        <w:spacing w:before="100"/>
+      </w:pPr>
+      <w:r>
+        <w:rPr>
+          <w:b/>
+        </w:rPr>
+        <w:t>PROFESSIONAL DEVELOPMENT</w:t>
       </w:r>
     </w:p>
     <w:p>
       <w:r>
         <w:t>Blue Team Level 1 (BTL1), Security Blue Team — exam preparation in progress; certification not yet earned.</w:t>
+      </w:r>
+    </w:p>
+    <w:p>
+      <w:r>
+        <w:t>6 published CTF writeups covering digital forensics, memory analysis, and web exploitation (darflashxd.my.id)</w:t>
       </w:r>
     </w:p>
     <w:sectPr>
@@ -637,11 +689,11 @@
     <w:qFormat/>
     <w:rsid w:val="00FC693F"/>
     <w:pPr>
-      <w:spacing w:after="60" w:line="240" w:lineRule="auto"/>
+      <w:spacing w:after="40" w:line="240" w:lineRule="auto"/>
     </w:pPr>
     <w:rPr>
       <w:rFonts w:ascii="Calibri" w:hAnsi="Calibri"/>
-      <w:sz w:val="21"/>
+      <w:sz w:val="20"/>
     </w:rPr>
   </w:style>
   <w:style w:type="paragraph" w:styleId="Header">

</xml_diff>

<commit_message>
Fix resume text extraction, links and award evidence
</commit_message>
<xml_diff>
--- a/public/CV_Ahmad_Rafi_Sutanto.docx
+++ b/public/CV_Ahmad_Rafi_Sutanto.docx
@@ -19,19 +19,54 @@
         <w:jc w:val="center"/>
       </w:pPr>
       <w:r>
-        <w:t>Tangerang &amp; Jakarta, Indonesia | +62 895-3831-57017 | rafisutanto@gmail.com</w:t>
+        <w:t>Tangerang &amp; Jakarta, Indonesia</w:t>
       </w:r>
+      <w:r>
+        <w:t xml:space="preserve"> | </w:t>
+      </w:r>
+      <w:hyperlink r:id="rId9">
+        <w:r>
+          <w:t>+62 895-3831-57017</w:t>
+        </w:r>
+      </w:hyperlink>
+      <w:r>
+        <w:t xml:space="preserve"> | </w:t>
+      </w:r>
+      <w:hyperlink r:id="rId10">
+        <w:r>
+          <w:t>rafisutanto@gmail.com</w:t>
+        </w:r>
+      </w:hyperlink>
     </w:p>
     <w:p>
       <w:pPr>
         <w:jc w:val="center"/>
       </w:pPr>
+      <w:hyperlink r:id="rId11">
+        <w:r>
+          <w:t>linkedin.com/in/rafisutanto</w:t>
+        </w:r>
+      </w:hyperlink>
       <w:r>
-        <w:t>linkedin.com/in/rafisutanto | github.com/darflashxd | darflashxd.my.id</w:t>
+        <w:t xml:space="preserve"> | </w:t>
       </w:r>
+      <w:hyperlink r:id="rId12">
+        <w:r>
+          <w:t>github.com/darflashxd</w:t>
+        </w:r>
+      </w:hyperlink>
+      <w:r>
+        <w:t xml:space="preserve"> | </w:t>
+      </w:r>
+      <w:hyperlink r:id="rId13">
+        <w:r>
+          <w:t>darflashxd.my.id</w:t>
+        </w:r>
+      </w:hyperlink>
     </w:p>
     <w:p>
       <w:pPr>
+        <w:keepNext/>
         <w:spacing w:before="100"/>
       </w:pPr>
       <w:r>
@@ -43,11 +78,12 @@
     </w:p>
     <w:p>
       <w:r>
-        <w:t>Cybersecurity undergraduate at BINUS University with hands-on experience in digital forensics challenge authoring, privacy tooling development, and CTF infrastructure automation. Finalist at Wreck-IT 7.0 national cyber competition. Seeking an internship in digital forensics, security operations, or defensive security engineering.</w:t>
+        <w:t>Cybersecurity undergraduate focused on digital forensics and defensive security. Develops forensic challenges, privacy tools, and CTF infrastructure; seeking a cybersecurity internship.</w:t>
       </w:r>
     </w:p>
     <w:p>
       <w:pPr>
+        <w:keepNext/>
         <w:spacing w:before="100"/>
       </w:pPr>
       <w:r>
@@ -75,6 +111,7 @@
     </w:p>
     <w:p>
       <w:pPr>
+        <w:keepNext/>
         <w:spacing w:before="100"/>
       </w:pPr>
       <w:r>
@@ -92,17 +129,17 @@
         <w:rPr>
           <w:b/>
         </w:rPr>
-        <w:t>Apprentice &amp; Digital Forensics Challenge Author | PETIR Cyber Security | Mar 2026–Present</w:t>
+        <w:t>Apprentice | PETIR Cyber Security | Mar 2026–Present</w:t>
       </w:r>
     </w:p>
     <w:p>
       <w:r>
-        <w:t>• Developed forensic challenges for IFEST 2026 (Universitas Padjadjaran) and BeeCTF 2026: LUKS volume encryption, ext4 artifact carving, and a simulated malicious Arch Linux AUR package with multi-layer evidence trails.</w:t>
+        <w:t>• Authored IFEST and BeeCTF forensic challenges in Aug 2026, covering LUKS encryption, ext4 carving, and a simulated malicious AUR package.</w:t>
       </w:r>
     </w:p>
     <w:p>
       <w:r>
-        <w:t>• Authored reference writeups covering both Linux CLI and FTK Imager investigation paths; built automated validation solvers to guarantee challenge integrity.</w:t>
+        <w:t>• Documented Linux CLI and FTK Imager investigation paths; built validation solvers to check intended solutions.</w:t>
       </w:r>
     </w:p>
     <w:p>
@@ -123,7 +160,7 @@
     </w:p>
     <w:p>
       <w:r>
-        <w:t>• Built GitHub Actions CI/CD workflows that auto-sync challenge metadata to CTFd via ctfcli and deploy Docker services to VPS over SSH, eliminating manual deployment on competition day.</w:t>
+        <w:t>• Built GitHub Actions workflows to sync challenge metadata to CTFd via ctfcli and deploy Docker services to a VPS over SSH.</w:t>
       </w:r>
     </w:p>
     <w:p>
@@ -139,7 +176,7 @@
     </w:p>
     <w:p>
       <w:r>
-        <w:t>• Led event operations for 200+ national university participants, including an on-site IoT Hacking CTF final and workshops on web penetration testing and adversarial AI.</w:t>
+        <w:t>• Led competition operations, an on-site IoT hacking final, and workshops on web penetration testing and adversarial AI.</w:t>
       </w:r>
     </w:p>
     <w:p>
@@ -160,6 +197,7 @@
     </w:p>
     <w:p>
       <w:pPr>
+        <w:keepNext/>
         <w:spacing w:before="100"/>
       </w:pPr>
       <w:r>
@@ -181,9 +219,11 @@
       </w:r>
     </w:p>
     <w:p>
-      <w:r>
-        <w:t>github.com/darflashxd/safeshare</w:t>
-      </w:r>
+      <w:hyperlink r:id="rId14">
+        <w:r>
+          <w:t>github.com/darflashxd/safeshare</w:t>
+        </w:r>
+      </w:hyperlink>
     </w:p>
     <w:p>
       <w:r>
@@ -207,9 +247,11 @@
       </w:r>
     </w:p>
     <w:p>
-      <w:r>
-        <w:t>github.com/PETIRsec/beefest-2026-qual</w:t>
-      </w:r>
+      <w:hyperlink r:id="rId15">
+        <w:r>
+          <w:t>github.com/PETIRsec/beefest-2026-qual</w:t>
+        </w:r>
+      </w:hyperlink>
     </w:p>
     <w:p>
       <w:r>
@@ -228,17 +270,20 @@
       </w:r>
     </w:p>
     <w:p>
-      <w:r>
-        <w:t>github.com/darflashxd/pulmoai</w:t>
-      </w:r>
+      <w:hyperlink r:id="rId16">
+        <w:r>
+          <w:t>github.com/darflashxd/pulmoai</w:t>
+        </w:r>
+      </w:hyperlink>
     </w:p>
     <w:p>
       <w:r>
-        <w:t>• Optimized CNN model from VGG to MobileNetV2 via transfer learning, reducing model size by 90% while achieving 99.65% validation accuracy. Full-stack app with Flask backend and React frontend.</w:t>
+        <w:t>• Replaced a VGG-style CNN with MobileNetV2 using transfer learning for a chest X-ray classification app with Flask and React.</w:t>
       </w:r>
     </w:p>
     <w:p>
       <w:pPr>
+        <w:keepNext/>
         <w:spacing w:before="100"/>
       </w:pPr>
       <w:r>
@@ -275,27 +320,31 @@
     </w:p>
     <w:p>
       <w:pPr>
+        <w:keepNext/>
         <w:spacing w:before="100"/>
       </w:pPr>
       <w:r>
         <w:rPr>
           <w:b/>
         </w:rPr>
-        <w:t>AWARDS &amp; COMPETITIONS</w:t>
+        <w:t>AWARDS</w:t>
       </w:r>
     </w:p>
     <w:p>
       <w:r>
-        <w:t>Finalist, Wreck-IT 7.0 General CTF | Politeknik Siber dan Sandi Negara (BSSN) | Aug 2026 | Team HM Plenger</w:t>
+        <w:t>Finalist — Wreck-IT 7.0, General Capture The Flag | Poltek SSN | Aug 2026 | Team HM Plenger</w:t>
       </w:r>
     </w:p>
     <w:p>
-      <w:r>
-        <w:t>Competitor: GEMASTIK (Kemendikbudristek), FindIT! (UGM), IFEST (UNPAD), Polri Cyber CTF, Gundar CTF | 2025–2026</w:t>
-      </w:r>
+      <w:hyperlink r:id="rId17">
+        <w:r>
+          <w:t>darflashxd.my.id/certificates/cert-wreckit-finalist.pdf</w:t>
+        </w:r>
+      </w:hyperlink>
     </w:p>
     <w:p>
       <w:pPr>
+        <w:keepNext/>
         <w:spacing w:before="100"/>
       </w:pPr>
       <w:r>
@@ -308,11 +357,6 @@
     <w:p>
       <w:r>
         <w:t>Blue Team Level 1 (BTL1), Security Blue Team — exam preparation in progress; certification not yet earned.</w:t>
-      </w:r>
-    </w:p>
-    <w:p>
-      <w:r>
-        <w:t>6 published CTF writeups covering digital forensics, memory analysis, and web exploitation (darflashxd.my.id)</w:t>
       </w:r>
     </w:p>
     <w:sectPr>
@@ -693,7 +737,7 @@
     </w:pPr>
     <w:rPr>
       <w:rFonts w:ascii="Calibri" w:hAnsi="Calibri"/>
-      <w:sz w:val="20"/>
+      <w:sz w:val="21"/>
     </w:rPr>
   </w:style>
   <w:style w:type="paragraph" w:styleId="Header">

</xml_diff>

<commit_message>
Show Wreck-IT recognition and update PETIR membership
</commit_message>
<xml_diff>
--- a/public/CV_Ahmad_Rafi_Sutanto.docx
+++ b/public/CV_Ahmad_Rafi_Sutanto.docx
@@ -129,7 +129,12 @@
         <w:rPr>
           <w:b/>
         </w:rPr>
-        <w:t>Apprentice | PETIR Cyber Security | Mar 2026–Present</w:t>
+        <w:t>Member | PETIR Cyber Security | Oct 2026–Present</w:t>
+      </w:r>
+    </w:p>
+    <w:p>
+      <w:r>
+        <w:t>Previously Apprentice | Mar–Oct 2026</w:t>
       </w:r>
     </w:p>
     <w:p>

</xml_diff>